<commit_message>
feat(comms): pristine Office templates with Brand Kit logo injection
Co-authored-by: Cursor <cursoragent@cursor.com>
</commit_message>
<xml_diff>
--- a/public/templates/office/docx/sample-letter.docx
+++ b/public/templates/office/docx/sample-letter.docx
@@ -3,46 +3,136 @@
 <w:document xmlns:w="http://schemas.openxmlformats.org/wordprocessingml/2006/main">
   <w:body>
     <w:p>
+      <w:pPr>
+        <w:pStyle w:val="Heading1"/>
+        <w:spacing w:after="120"/>
+      </w:pPr>
       <w:r>
+        <w:rPr>
+          <w:rFonts w:ascii="Calibri" w:hAnsi="Calibri"/>
+          <w:b/>
+        </w:rPr>
         <w:t xml:space="preserve">Sample letter — Local {localNumber}</w:t>
       </w:r>
     </w:p>
     <w:p>
+      <w:pPr>
+        <w:spacing w:after="120"/>
+      </w:pPr>
       <w:r>
+        <w:rPr>
+          <w:rFonts w:ascii="Calibri" w:hAnsi="Calibri"/>
+        </w:rPr>
         <w:t xml:space="preserve">Dear {memberName},</w:t>
       </w:r>
     </w:p>
     <w:p>
+      <w:pPr>
+        <w:spacing w:after="120"/>
+      </w:pPr>
       <w:r>
+        <w:rPr>
+          <w:rFonts w:ascii="Calibri" w:hAnsi="Calibri"/>
+        </w:rPr>
         <w:t xml:space="preserve">{body}</w:t>
       </w:r>
     </w:p>
     <w:p>
+      <w:pPr>
+        <w:spacing w:after="120"/>
+      </w:pPr>
       <w:r>
+        <w:rPr>
+          <w:rFonts w:ascii="Calibri" w:hAnsi="Calibri"/>
+        </w:rPr>
         <w:t xml:space="preserve">In solidarity,</w:t>
       </w:r>
     </w:p>
     <w:p>
+      <w:pPr>
+        <w:spacing w:after="120"/>
+      </w:pPr>
       <w:r>
+        <w:rPr>
+          <w:rFonts w:ascii="Calibri" w:hAnsi="Calibri"/>
+        </w:rPr>
         <w:t xml:space="preserve">{stewardName}</w:t>
       </w:r>
     </w:p>
     <w:p>
+      <w:pPr>
+        <w:spacing w:after="120"/>
+      </w:pPr>
       <w:r>
+        <w:rPr>
+          <w:rFonts w:ascii="Calibri" w:hAnsi="Calibri"/>
+        </w:rPr>
         <w:t xml:space="preserve">{#items}</w:t>
       </w:r>
     </w:p>
     <w:p>
+      <w:pPr>
+        <w:spacing w:after="120"/>
+      </w:pPr>
       <w:r>
+        <w:rPr>
+          <w:rFonts w:ascii="Calibri" w:hAnsi="Calibri"/>
+        </w:rPr>
         <w:t xml:space="preserve">- {label}: {detail}</w:t>
       </w:r>
     </w:p>
     <w:p>
+      <w:pPr>
+        <w:spacing w:after="120"/>
+      </w:pPr>
       <w:r>
+        <w:rPr>
+          <w:rFonts w:ascii="Calibri" w:hAnsi="Calibri"/>
+        </w:rPr>
         <w:t xml:space="preserve">{/items}</w:t>
       </w:r>
     </w:p>
-    <w:sectPr/>
+    <w:sectPr>
+      <w:pgSz w:w="12240" w:h="15840"/>
+      <w:pgMar w:top="1008" w:right="1008" w:bottom="1008" w:left="1008" w:header="720" w:footer="720"/>
+    </w:sectPr>
   </w:body>
 </w:document>
+</file>
+
+<file path=word/styles.xml><?xml version="1.0" encoding="utf-8"?>
+<w:styles xmlns:w="http://schemas.openxmlformats.org/wordprocessingml/2006/main">
+  <w:style w:type="paragraph" w:default="1" w:styleId="Normal">
+    <w:name w:val="Normal"/>
+    <w:qFormat/>
+    <w:rPr>
+      <w:rFonts w:ascii="Calibri" w:hAnsi="Calibri"/>
+      <w:sz w:val="22"/>
+    </w:rPr>
+  </w:style>
+  <w:style w:type="paragraph" w:styleId="Title">
+    <w:name w:val="Title"/>
+    <w:basedOn w:val="Normal"/>
+    <w:qFormat/>
+    <w:pPr>
+      <w:spacing w:before="120" w:after="200"/>
+    </w:pPr>
+    <w:rPr>
+      <w:b/>
+      <w:sz w:val="36"/>
+    </w:rPr>
+  </w:style>
+  <w:style w:type="paragraph" w:styleId="Heading1">
+    <w:name w:val="heading 1"/>
+    <w:basedOn w:val="Normal"/>
+    <w:qFormat/>
+    <w:pPr>
+      <w:spacing w:before="200" w:after="120"/>
+    </w:pPr>
+    <w:rPr>
+      <w:b/>
+      <w:sz w:val="28"/>
+    </w:rPr>
+  </w:style>
+</w:styles>
 </file>
</xml_diff>